<commit_message>
added submitters info + answered 2a
</commit_message>
<xml_diff>
--- a/hw1_dry.docx
+++ b/hw1_dry.docx
@@ -4,14 +4,250 @@
   <w:body>
     <w:p>
       <w:pPr>
-        <w:rPr>
-          <w:rFonts w:hint="cs"/>
-          <w:rtl/>
-        </w:rPr>
-      </w:pPr>
-      <w:r>
-        <w:rPr>
-          <w:rFonts w:hint="cs"/>
+        <w:jc w:val="center"/>
+        <w:rPr>
+          <w:b/>
+          <w:bCs/>
+          <w:sz w:val="40"/>
+          <w:szCs w:val="40"/>
+          <w:u w:val="single"/>
+          <w:rtl/>
+        </w:rPr>
+      </w:pPr>
+      <w:r>
+        <w:rPr>
+          <w:rFonts w:hint="cs"/>
+          <w:b/>
+          <w:bCs/>
+          <w:sz w:val="40"/>
+          <w:szCs w:val="40"/>
+          <w:u w:val="single"/>
+          <w:rtl/>
+        </w:rPr>
+        <w:t xml:space="preserve">מבנה  מחשבים </w:t>
+      </w:r>
+      <w:r>
+        <w:rPr>
+          <w:b/>
+          <w:bCs/>
+          <w:sz w:val="40"/>
+          <w:szCs w:val="40"/>
+          <w:u w:val="single"/>
+          <w:rtl/>
+        </w:rPr>
+        <w:t>–</w:t>
+      </w:r>
+      <w:r>
+        <w:rPr>
+          <w:rFonts w:hint="cs"/>
+          <w:b/>
+          <w:bCs/>
+          <w:sz w:val="40"/>
+          <w:szCs w:val="40"/>
+          <w:u w:val="single"/>
+          <w:rtl/>
+        </w:rPr>
+        <w:t xml:space="preserve"> תרגיל בית 1</w:t>
+      </w:r>
+    </w:p>
+    <w:p>
+      <w:pPr>
+        <w:jc w:val="center"/>
+        <w:rPr>
+          <w:i/>
+          <w:iCs/>
+          <w:sz w:val="36"/>
+          <w:szCs w:val="36"/>
+          <w:rtl/>
+        </w:rPr>
+      </w:pPr>
+      <w:r>
+        <w:rPr>
+          <w:rFonts w:hint="cs"/>
+          <w:i/>
+          <w:iCs/>
+          <w:sz w:val="36"/>
+          <w:szCs w:val="36"/>
+          <w:u w:val="single"/>
+          <w:rtl/>
+        </w:rPr>
+        <w:t>חלק יבש</w:t>
+      </w:r>
+    </w:p>
+    <w:p>
+      <w:pPr>
+        <w:rPr>
+          <w:rFonts w:hint="cs"/>
+          <w:u w:val="single"/>
+          <w:rtl/>
+        </w:rPr>
+      </w:pPr>
+      <w:r>
+        <w:rPr>
+          <w:rFonts w:hint="cs"/>
+          <w:u w:val="single"/>
+          <w:rtl/>
+        </w:rPr>
+        <w:t>מגישים:</w:t>
+      </w:r>
+    </w:p>
+    <w:p>
+      <w:pPr>
+        <w:rPr>
+          <w:rtl/>
+        </w:rPr>
+      </w:pPr>
+      <w:r>
+        <w:rPr>
+          <w:rFonts w:hint="cs"/>
+          <w:rtl/>
+        </w:rPr>
+        <w:t>אביב אלימלך</w:t>
+      </w:r>
+    </w:p>
+    <w:p>
+      <w:pPr>
+        <w:rPr>
+          <w:rtl/>
+        </w:rPr>
+      </w:pPr>
+      <w:r>
+        <w:rPr>
+          <w:rFonts w:hint="cs"/>
+          <w:sz w:val="20"/>
+          <w:szCs w:val="20"/>
+          <w:rtl/>
+        </w:rPr>
+        <w:t>ת"ז: 215248519</w:t>
+      </w:r>
+      <w:r>
+        <w:rPr>
+          <w:sz w:val="20"/>
+          <w:szCs w:val="20"/>
+          <w:rtl/>
+        </w:rPr>
+        <w:br/>
+      </w:r>
+      <w:r>
+        <w:rPr>
+          <w:rFonts w:hint="cs"/>
+          <w:sz w:val="20"/>
+          <w:szCs w:val="20"/>
+          <w:rtl/>
+        </w:rPr>
+        <w:t xml:space="preserve">מייל: </w:t>
+      </w:r>
+      <w:hyperlink r:id="rId5" w:history="1">
+        <w:r>
+          <w:rPr>
+            <w:rStyle w:val="Hyperlink"/>
+            <w:sz w:val="20"/>
+            <w:szCs w:val="20"/>
+          </w:rPr>
+          <w:t>avive@campus.technion.ac.il</w:t>
+        </w:r>
+      </w:hyperlink>
+    </w:p>
+    <w:p>
+      <w:pPr>
+        <w:rPr>
+          <w:rtl/>
+        </w:rPr>
+      </w:pPr>
+      <w:r>
+        <w:rPr>
+          <w:rFonts w:hint="cs"/>
+          <w:rtl/>
+        </w:rPr>
+        <w:t xml:space="preserve">אילן </w:t>
+      </w:r>
+      <w:proofErr w:type="spellStart"/>
+      <w:r>
+        <w:rPr>
+          <w:rFonts w:hint="cs"/>
+          <w:rtl/>
+        </w:rPr>
+        <w:t>בלווקה</w:t>
+      </w:r>
+      <w:proofErr w:type="spellEnd"/>
+    </w:p>
+    <w:p>
+      <w:pPr>
+        <w:rPr>
+          <w:rFonts w:cs="Arial"/>
+          <w:rtl/>
+        </w:rPr>
+      </w:pPr>
+      <w:r>
+        <w:rPr>
+          <w:rFonts w:hint="cs"/>
+          <w:sz w:val="20"/>
+          <w:szCs w:val="20"/>
+          <w:rtl/>
+        </w:rPr>
+        <w:t xml:space="preserve">ת"ז: </w:t>
+      </w:r>
+      <w:r>
+        <w:rPr>
+          <w:rFonts w:cs="Arial"/>
+          <w:sz w:val="20"/>
+          <w:szCs w:val="20"/>
+          <w:rtl/>
+        </w:rPr>
+        <w:t>340875624</w:t>
+      </w:r>
+      <w:r>
+        <w:rPr>
+          <w:rFonts w:cs="Arial"/>
+          <w:sz w:val="20"/>
+          <w:szCs w:val="20"/>
+          <w:rtl/>
+        </w:rPr>
+        <w:br/>
+      </w:r>
+      <w:r>
+        <w:rPr>
+          <w:rFonts w:cs="Arial" w:hint="cs"/>
+          <w:sz w:val="20"/>
+          <w:szCs w:val="20"/>
+          <w:rtl/>
+        </w:rPr>
+        <w:t xml:space="preserve">מייל: </w:t>
+      </w:r>
+      <w:hyperlink r:id="rId6" w:history="1">
+        <w:r>
+          <w:rPr>
+            <w:rStyle w:val="Hyperlink"/>
+            <w:rFonts w:cs="Arial"/>
+            <w:sz w:val="20"/>
+            <w:szCs w:val="20"/>
+          </w:rPr>
+          <w:t>balouka.ilan@campus.technion.ac.il</w:t>
+        </w:r>
+      </w:hyperlink>
+    </w:p>
+    <w:p>
+      <w:pPr>
+        <w:rPr>
+          <w:rtl/>
+        </w:rPr>
+      </w:pPr>
+    </w:p>
+    <w:p>
+      <w:pPr>
+        <w:rPr>
+          <w:b/>
+          <w:bCs/>
+          <w:u w:val="single"/>
+          <w:rtl/>
+        </w:rPr>
+      </w:pPr>
+      <w:r>
+        <w:rPr>
+          <w:rFonts w:hint="cs"/>
+          <w:b/>
+          <w:bCs/>
+          <w:u w:val="single"/>
           <w:rtl/>
         </w:rPr>
         <w:t>שאלה 1:</w:t>
@@ -29,270 +265,334 @@
           <w:szCs w:val="20"/>
         </w:rPr>
       </w:pPr>
-      <m:oMath>
-        <m:r>
-          <w:rPr>
-            <w:rFonts w:ascii="Cambria Math" w:hAnsi="Cambria Math"/>
-            <w:sz w:val="20"/>
-            <w:szCs w:val="20"/>
-          </w:rPr>
-          <m:t>CPI=</m:t>
-        </m:r>
-        <m:nary>
-          <m:naryPr>
-            <m:chr m:val="∑"/>
-            <m:limLoc m:val="undOvr"/>
-            <m:subHide m:val="1"/>
-            <m:supHide m:val="1"/>
-            <m:ctrlPr>
-              <w:rPr>
-                <w:rFonts w:ascii="Cambria Math" w:hAnsi="Cambria Math"/>
-                <w:sz w:val="20"/>
-                <w:szCs w:val="20"/>
-              </w:rPr>
-            </m:ctrlPr>
-          </m:naryPr>
-          <m:sub/>
-          <m:sup/>
-          <m:e>
-            <m:r>
-              <w:rPr>
-                <w:rFonts w:ascii="Cambria Math" w:hAnsi="Cambria Math"/>
-                <w:sz w:val="20"/>
-                <w:szCs w:val="20"/>
-              </w:rPr>
-              <m:t>frequenc</m:t>
-            </m:r>
-            <m:sSub>
-              <m:sSubPr>
-                <m:ctrlPr>
-                  <w:rPr>
-                    <w:rFonts w:ascii="Cambria Math" w:hAnsi="Cambria Math"/>
-                    <w:i/>
-                    <w:sz w:val="20"/>
-                    <w:szCs w:val="20"/>
-                  </w:rPr>
-                </m:ctrlPr>
-              </m:sSubPr>
-              <m:e>
-                <m:r>
-                  <w:rPr>
-                    <w:rFonts w:ascii="Cambria Math" w:hAnsi="Cambria Math"/>
-                    <w:sz w:val="20"/>
-                    <w:szCs w:val="20"/>
-                  </w:rPr>
-                  <m:t>y</m:t>
-                </m:r>
-              </m:e>
-              <m:sub>
-                <m:r>
-                  <w:rPr>
-                    <w:rFonts w:ascii="Cambria Math" w:hAnsi="Cambria Math"/>
-                    <w:sz w:val="20"/>
-                    <w:szCs w:val="20"/>
-                  </w:rPr>
-                  <m:t>i</m:t>
-                </m:r>
-              </m:sub>
-            </m:sSub>
-            <m:r>
-              <w:rPr>
-                <w:rFonts w:ascii="Cambria Math" w:hAnsi="Cambria Math"/>
-                <w:sz w:val="20"/>
-                <w:szCs w:val="20"/>
-              </w:rPr>
-              <m:t>*clock</m:t>
-            </m:r>
-            <m:r>
-              <m:rPr>
-                <m:lit/>
-              </m:rPr>
-              <w:rPr>
-                <w:rFonts w:ascii="Cambria Math" w:hAnsi="Cambria Math"/>
-                <w:sz w:val="20"/>
-                <w:szCs w:val="20"/>
-              </w:rPr>
-              <m:t>_</m:t>
-            </m:r>
-            <m:r>
-              <w:rPr>
-                <w:rFonts w:ascii="Cambria Math" w:hAnsi="Cambria Math"/>
-                <w:sz w:val="20"/>
-                <w:szCs w:val="20"/>
-              </w:rPr>
-              <m:t>cycle</m:t>
-            </m:r>
-            <m:sSub>
-              <m:sSubPr>
-                <m:ctrlPr>
-                  <w:rPr>
-                    <w:rFonts w:ascii="Cambria Math" w:hAnsi="Cambria Math"/>
-                    <w:i/>
-                    <w:sz w:val="20"/>
-                    <w:szCs w:val="20"/>
-                  </w:rPr>
-                </m:ctrlPr>
-              </m:sSubPr>
-              <m:e>
-                <m:r>
-                  <w:rPr>
-                    <w:rFonts w:ascii="Cambria Math" w:hAnsi="Cambria Math"/>
-                    <w:sz w:val="20"/>
-                    <w:szCs w:val="20"/>
-                  </w:rPr>
-                  <m:t>s</m:t>
-                </m:r>
-              </m:e>
-              <m:sub>
-                <m:r>
-                  <w:rPr>
-                    <w:rFonts w:ascii="Cambria Math" w:hAnsi="Cambria Math"/>
-                    <w:sz w:val="20"/>
-                    <w:szCs w:val="20"/>
-                  </w:rPr>
-                  <m:t>i</m:t>
-                </m:r>
-              </m:sub>
-            </m:sSub>
-          </m:e>
-        </m:nary>
-        <m:r>
-          <w:rPr>
-            <w:rFonts w:ascii="Cambria Math" w:hAnsi="Cambria Math"/>
-            <w:sz w:val="20"/>
-            <w:szCs w:val="20"/>
-          </w:rPr>
-          <m:t>=</m:t>
-        </m:r>
-        <m:d>
-          <m:dPr>
-            <m:ctrlPr>
-              <w:rPr>
-                <w:rFonts w:ascii="Cambria Math" w:hAnsi="Cambria Math"/>
-                <w:i/>
-                <w:sz w:val="20"/>
-                <w:szCs w:val="20"/>
-              </w:rPr>
-            </m:ctrlPr>
-          </m:dPr>
-          <m:e>
-            <m:r>
-              <w:rPr>
-                <w:rFonts w:ascii="Cambria Math" w:hAnsi="Cambria Math"/>
-                <w:sz w:val="20"/>
-                <w:szCs w:val="20"/>
-              </w:rPr>
-              <m:t>0.5*1</m:t>
-            </m:r>
-          </m:e>
-        </m:d>
-        <m:r>
-          <w:rPr>
-            <w:rFonts w:ascii="Cambria Math" w:hAnsi="Cambria Math"/>
-            <w:sz w:val="20"/>
-            <w:szCs w:val="20"/>
-          </w:rPr>
-          <m:t>+</m:t>
-        </m:r>
-        <m:d>
-          <m:dPr>
-            <m:ctrlPr>
-              <w:rPr>
-                <w:rFonts w:ascii="Cambria Math" w:hAnsi="Cambria Math"/>
-                <w:i/>
-                <w:sz w:val="20"/>
-                <w:szCs w:val="20"/>
-              </w:rPr>
-            </m:ctrlPr>
-          </m:dPr>
-          <m:e>
-            <m:r>
-              <w:rPr>
-                <w:rFonts w:ascii="Cambria Math" w:hAnsi="Cambria Math"/>
-                <w:sz w:val="20"/>
-                <w:szCs w:val="20"/>
-              </w:rPr>
-              <m:t>0.15*5</m:t>
-            </m:r>
-          </m:e>
-        </m:d>
-        <m:r>
-          <w:rPr>
-            <w:rFonts w:ascii="Cambria Math" w:hAnsi="Cambria Math"/>
-            <w:sz w:val="20"/>
-            <w:szCs w:val="20"/>
-          </w:rPr>
-          <m:t>+</m:t>
-        </m:r>
-        <m:d>
-          <m:dPr>
-            <m:ctrlPr>
-              <w:rPr>
-                <w:rFonts w:ascii="Cambria Math" w:hAnsi="Cambria Math"/>
-                <w:i/>
-                <w:sz w:val="20"/>
-                <w:szCs w:val="20"/>
-              </w:rPr>
-            </m:ctrlPr>
-          </m:dPr>
-          <m:e>
-            <m:r>
-              <w:rPr>
-                <w:rFonts w:ascii="Cambria Math" w:hAnsi="Cambria Math"/>
-                <w:sz w:val="20"/>
-                <w:szCs w:val="20"/>
-              </w:rPr>
-              <m:t>0.2*4</m:t>
-            </m:r>
-          </m:e>
-        </m:d>
-        <m:r>
-          <w:rPr>
-            <w:rFonts w:ascii="Cambria Math" w:hAnsi="Cambria Math"/>
-            <w:sz w:val="20"/>
-            <w:szCs w:val="20"/>
-          </w:rPr>
-          <m:t>+</m:t>
-        </m:r>
-        <m:d>
-          <m:dPr>
-            <m:ctrlPr>
-              <w:rPr>
-                <w:rFonts w:ascii="Cambria Math" w:hAnsi="Cambria Math"/>
-                <w:i/>
-                <w:sz w:val="20"/>
-                <w:szCs w:val="20"/>
-              </w:rPr>
-            </m:ctrlPr>
-          </m:dPr>
-          <m:e>
-            <m:r>
-              <w:rPr>
-                <w:rFonts w:ascii="Cambria Math" w:hAnsi="Cambria Math"/>
-                <w:sz w:val="20"/>
-                <w:szCs w:val="20"/>
-              </w:rPr>
-              <m:t>0.15*2</m:t>
-            </m:r>
-          </m:e>
-        </m:d>
-        <m:r>
-          <w:rPr>
-            <w:rFonts w:ascii="Cambria Math" w:eastAsiaTheme="minorEastAsia" w:hAnsi="Cambria Math"/>
-            <w:sz w:val="20"/>
-            <w:szCs w:val="20"/>
-          </w:rPr>
-          <m:t>=</m:t>
-        </m:r>
-        <m:r>
-          <w:rPr>
-            <w:rFonts w:ascii="Cambria Math" w:hAnsi="Cambria Math"/>
-            <w:sz w:val="20"/>
-            <w:szCs w:val="20"/>
-          </w:rPr>
-          <m:t>0.5+0.75+0.8+0.3=2.35</m:t>
-        </m:r>
-      </m:oMath>
+    </w:p>
+    <w:p>
+      <w:pPr>
+        <w:pStyle w:val="a9"/>
+        <w:rPr>
+          <w:sz w:val="20"/>
+          <w:szCs w:val="20"/>
+        </w:rPr>
+      </w:pPr>
+      <m:oMathPara>
+        <m:oMathParaPr>
+          <m:jc m:val="center"/>
+        </m:oMathParaPr>
+        <m:oMath>
+          <m:r>
+            <w:rPr>
+              <w:rFonts w:ascii="Cambria Math" w:hAnsi="Cambria Math"/>
+              <w:sz w:val="20"/>
+              <w:szCs w:val="20"/>
+            </w:rPr>
+            <m:t>CPI=</m:t>
+          </m:r>
+          <m:nary>
+            <m:naryPr>
+              <m:chr m:val="∑"/>
+              <m:limLoc m:val="undOvr"/>
+              <m:subHide m:val="1"/>
+              <m:supHide m:val="1"/>
+              <m:ctrlPr>
+                <w:rPr>
+                  <w:rFonts w:ascii="Cambria Math" w:hAnsi="Cambria Math"/>
+                  <w:sz w:val="20"/>
+                  <w:szCs w:val="20"/>
+                </w:rPr>
+              </m:ctrlPr>
+            </m:naryPr>
+            <m:sub/>
+            <m:sup/>
+            <m:e>
+              <m:r>
+                <w:rPr>
+                  <w:rFonts w:ascii="Cambria Math" w:hAnsi="Cambria Math"/>
+                  <w:sz w:val="20"/>
+                  <w:szCs w:val="20"/>
+                </w:rPr>
+                <m:t>frequenc</m:t>
+              </m:r>
+              <m:sSub>
+                <m:sSubPr>
+                  <m:ctrlPr>
+                    <w:rPr>
+                      <w:rFonts w:ascii="Cambria Math" w:hAnsi="Cambria Math"/>
+                      <w:i/>
+                      <w:sz w:val="20"/>
+                      <w:szCs w:val="20"/>
+                    </w:rPr>
+                  </m:ctrlPr>
+                </m:sSubPr>
+                <m:e>
+                  <m:r>
+                    <w:rPr>
+                      <w:rFonts w:ascii="Cambria Math" w:hAnsi="Cambria Math"/>
+                      <w:sz w:val="20"/>
+                      <w:szCs w:val="20"/>
+                    </w:rPr>
+                    <m:t>y</m:t>
+                  </m:r>
+                </m:e>
+                <m:sub>
+                  <m:r>
+                    <w:rPr>
+                      <w:rFonts w:ascii="Cambria Math" w:hAnsi="Cambria Math"/>
+                      <w:sz w:val="20"/>
+                      <w:szCs w:val="20"/>
+                    </w:rPr>
+                    <m:t>i</m:t>
+                  </m:r>
+                </m:sub>
+              </m:sSub>
+              <m:r>
+                <w:rPr>
+                  <w:rFonts w:ascii="Cambria Math" w:hAnsi="Cambria Math"/>
+                  <w:sz w:val="20"/>
+                  <w:szCs w:val="20"/>
+                </w:rPr>
+                <m:t>*clock</m:t>
+              </m:r>
+              <m:r>
+                <m:rPr>
+                  <m:lit/>
+                </m:rPr>
+                <w:rPr>
+                  <w:rFonts w:ascii="Cambria Math" w:hAnsi="Cambria Math"/>
+                  <w:sz w:val="20"/>
+                  <w:szCs w:val="20"/>
+                </w:rPr>
+                <m:t>_</m:t>
+              </m:r>
+              <m:r>
+                <w:rPr>
+                  <w:rFonts w:ascii="Cambria Math" w:hAnsi="Cambria Math"/>
+                  <w:sz w:val="20"/>
+                  <w:szCs w:val="20"/>
+                </w:rPr>
+                <m:t>cycle</m:t>
+              </m:r>
+              <m:sSub>
+                <m:sSubPr>
+                  <m:ctrlPr>
+                    <w:rPr>
+                      <w:rFonts w:ascii="Cambria Math" w:hAnsi="Cambria Math"/>
+                      <w:i/>
+                      <w:sz w:val="20"/>
+                      <w:szCs w:val="20"/>
+                    </w:rPr>
+                  </m:ctrlPr>
+                </m:sSubPr>
+                <m:e>
+                  <m:r>
+                    <w:rPr>
+                      <w:rFonts w:ascii="Cambria Math" w:hAnsi="Cambria Math"/>
+                      <w:sz w:val="20"/>
+                      <w:szCs w:val="20"/>
+                    </w:rPr>
+                    <m:t>s</m:t>
+                  </m:r>
+                </m:e>
+                <m:sub>
+                  <m:r>
+                    <w:rPr>
+                      <w:rFonts w:ascii="Cambria Math" w:hAnsi="Cambria Math"/>
+                      <w:sz w:val="20"/>
+                      <w:szCs w:val="20"/>
+                    </w:rPr>
+                    <m:t>i</m:t>
+                  </m:r>
+                </m:sub>
+              </m:sSub>
+            </m:e>
+          </m:nary>
+          <m:r>
+            <w:rPr>
+              <w:rFonts w:ascii="Cambria Math" w:hAnsi="Cambria Math"/>
+              <w:sz w:val="20"/>
+              <w:szCs w:val="20"/>
+            </w:rPr>
+            <m:t>=</m:t>
+          </m:r>
+          <m:r>
+            <w:rPr>
+              <w:rFonts w:ascii="Cambria Math" w:hAnsi="Cambria Math"/>
+              <w:sz w:val="20"/>
+              <w:szCs w:val="20"/>
+            </w:rPr>
+            <w:br/>
+          </m:r>
+        </m:oMath>
+        <m:oMath>
+          <m:d>
+            <m:dPr>
+              <m:ctrlPr>
+                <w:rPr>
+                  <w:rFonts w:ascii="Cambria Math" w:hAnsi="Cambria Math"/>
+                  <w:i/>
+                  <w:sz w:val="20"/>
+                  <w:szCs w:val="20"/>
+                </w:rPr>
+              </m:ctrlPr>
+            </m:dPr>
+            <m:e>
+              <m:r>
+                <w:rPr>
+                  <w:rFonts w:ascii="Cambria Math" w:hAnsi="Cambria Math"/>
+                  <w:sz w:val="20"/>
+                  <w:szCs w:val="20"/>
+                </w:rPr>
+                <m:t>0.5*1</m:t>
+              </m:r>
+            </m:e>
+          </m:d>
+          <m:r>
+            <w:rPr>
+              <w:rFonts w:ascii="Cambria Math" w:hAnsi="Cambria Math"/>
+              <w:sz w:val="20"/>
+              <w:szCs w:val="20"/>
+            </w:rPr>
+            <m:t>+</m:t>
+          </m:r>
+          <m:d>
+            <m:dPr>
+              <m:ctrlPr>
+                <w:rPr>
+                  <w:rFonts w:ascii="Cambria Math" w:hAnsi="Cambria Math"/>
+                  <w:i/>
+                  <w:sz w:val="20"/>
+                  <w:szCs w:val="20"/>
+                </w:rPr>
+              </m:ctrlPr>
+            </m:dPr>
+            <m:e>
+              <m:r>
+                <w:rPr>
+                  <w:rFonts w:ascii="Cambria Math" w:hAnsi="Cambria Math"/>
+                  <w:sz w:val="20"/>
+                  <w:szCs w:val="20"/>
+                </w:rPr>
+                <m:t>0.15*5</m:t>
+              </m:r>
+            </m:e>
+          </m:d>
+          <m:r>
+            <w:rPr>
+              <w:rFonts w:ascii="Cambria Math" w:hAnsi="Cambria Math"/>
+              <w:sz w:val="20"/>
+              <w:szCs w:val="20"/>
+            </w:rPr>
+            <m:t>+</m:t>
+          </m:r>
+          <m:d>
+            <m:dPr>
+              <m:ctrlPr>
+                <w:rPr>
+                  <w:rFonts w:ascii="Cambria Math" w:hAnsi="Cambria Math"/>
+                  <w:i/>
+                  <w:sz w:val="20"/>
+                  <w:szCs w:val="20"/>
+                </w:rPr>
+              </m:ctrlPr>
+            </m:dPr>
+            <m:e>
+              <m:r>
+                <w:rPr>
+                  <w:rFonts w:ascii="Cambria Math" w:hAnsi="Cambria Math"/>
+                  <w:sz w:val="20"/>
+                  <w:szCs w:val="20"/>
+                </w:rPr>
+                <m:t>0.2*4</m:t>
+              </m:r>
+            </m:e>
+          </m:d>
+          <m:r>
+            <w:rPr>
+              <w:rFonts w:ascii="Cambria Math" w:hAnsi="Cambria Math"/>
+              <w:sz w:val="20"/>
+              <w:szCs w:val="20"/>
+            </w:rPr>
+            <m:t>+</m:t>
+          </m:r>
+          <m:d>
+            <m:dPr>
+              <m:ctrlPr>
+                <w:rPr>
+                  <w:rFonts w:ascii="Cambria Math" w:hAnsi="Cambria Math"/>
+                  <w:i/>
+                  <w:sz w:val="20"/>
+                  <w:szCs w:val="20"/>
+                </w:rPr>
+              </m:ctrlPr>
+            </m:dPr>
+            <m:e>
+              <m:r>
+                <w:rPr>
+                  <w:rFonts w:ascii="Cambria Math" w:hAnsi="Cambria Math"/>
+                  <w:sz w:val="20"/>
+                  <w:szCs w:val="20"/>
+                </w:rPr>
+                <m:t>0.15*2</m:t>
+              </m:r>
+            </m:e>
+          </m:d>
+          <m:r>
+            <w:rPr>
+              <w:rFonts w:ascii="Cambria Math" w:eastAsiaTheme="minorEastAsia" w:hAnsi="Cambria Math"/>
+              <w:sz w:val="20"/>
+              <w:szCs w:val="20"/>
+            </w:rPr>
+            <m:t>=</m:t>
+          </m:r>
+          <m:r>
+            <w:rPr>
+              <w:rFonts w:ascii="Cambria Math" w:eastAsiaTheme="minorEastAsia" w:hAnsi="Cambria Math"/>
+              <w:sz w:val="20"/>
+              <w:szCs w:val="20"/>
+            </w:rPr>
+            <w:br/>
+          </m:r>
+        </m:oMath>
+        <m:oMath>
+          <m:r>
+            <w:rPr>
+              <w:rFonts w:ascii="Cambria Math" w:hAnsi="Cambria Math"/>
+              <w:sz w:val="20"/>
+              <w:szCs w:val="20"/>
+            </w:rPr>
+            <m:t>0.5+0.75+0.8+0.3=</m:t>
+          </m:r>
+          <m:r>
+            <m:rPr>
+              <m:sty m:val="bi"/>
+            </m:rPr>
+            <w:rPr>
+              <w:rFonts w:ascii="Cambria Math" w:hAnsi="Cambria Math"/>
+              <w:sz w:val="20"/>
+              <w:szCs w:val="20"/>
+            </w:rPr>
+            <m:t>2.3</m:t>
+          </m:r>
+          <m:r>
+            <m:rPr>
+              <m:sty m:val="bi"/>
+            </m:rPr>
+            <w:rPr>
+              <w:rFonts w:ascii="Cambria Math" w:hAnsi="Cambria Math"/>
+              <w:sz w:val="20"/>
+              <w:szCs w:val="20"/>
+            </w:rPr>
+            <m:t>5</m:t>
+          </m:r>
+          <m:r>
+            <w:rPr>
+              <w:sz w:val="20"/>
+              <w:szCs w:val="20"/>
+              <w:rtl/>
+            </w:rPr>
+            <w:br/>
+          </m:r>
+        </m:oMath>
+      </m:oMathPara>
     </w:p>
     <w:p>
       <w:pPr>
@@ -317,7 +617,23 @@
           <w:rFonts w:hint="cs"/>
           <w:rtl/>
         </w:rPr>
-        <w:t xml:space="preserve"> ישאר זהה </w:t>
+        <w:t xml:space="preserve"> </w:t>
+      </w:r>
+      <w:proofErr w:type="spellStart"/>
+      <w:r>
+        <w:rPr>
+          <w:rFonts w:hint="cs"/>
+          <w:rtl/>
+        </w:rPr>
+        <w:t>ישאר</w:t>
+      </w:r>
+      <w:proofErr w:type="spellEnd"/>
+      <w:r>
+        <w:rPr>
+          <w:rFonts w:hint="cs"/>
+          <w:rtl/>
+        </w:rPr>
+        <w:t xml:space="preserve"> זהה </w:t>
       </w:r>
       <w:r>
         <w:rPr>
@@ -330,7 +646,43 @@
           <w:rFonts w:hint="cs"/>
           <w:rtl/>
         </w:rPr>
-        <w:t xml:space="preserve"> הקטנה של זמן מחזור השעון, בתנאי שזה השינוי היחידי שנעשה במעבד, לא תגרום לשינוי בכמות הפקודות למחזור שעון, אלא רק לביצוע מהיר יותר של כל פקודה (שוב, בתנאי והמעבד עדייו עומד באילוצי זמנים וכל פקודה מספיקה לסיים את השלב שבו היא נמצאת בזמן קטן פי 2 ממקודם)</w:t>
+        <w:t xml:space="preserve"> הקטנה של זמן מחזור השעון, בתנאי שזה השינוי </w:t>
+      </w:r>
+      <w:r>
+        <w:rPr>
+          <w:rFonts w:hint="cs"/>
+          <w:b/>
+          <w:bCs/>
+          <w:rtl/>
+        </w:rPr>
+        <w:t>היחידי</w:t>
+      </w:r>
+      <w:r>
+        <w:rPr>
+          <w:rFonts w:hint="cs"/>
+          <w:rtl/>
+        </w:rPr>
+        <w:t xml:space="preserve"> שנעשה במעבד, לא תגרום לשינוי בכמות הפקודות למחזור שעון, אלא רק לביצוע מהיר יותר של כל פקודה (</w:t>
+      </w:r>
+      <w:r>
+        <w:rPr>
+          <w:rFonts w:hint="cs"/>
+          <w:rtl/>
+        </w:rPr>
+        <w:t>בהנחה</w:t>
+      </w:r>
+      <w:r>
+        <w:rPr>
+          <w:rFonts w:hint="cs"/>
+          <w:rtl/>
+        </w:rPr>
+        <w:t xml:space="preserve"> והמעבד עדייו עומד באילוצי זמנים וכל פקודה מספיקה לסיים את השלב שבו היא נמצאת בזמן קטן פי 2 ממקודם)</w:t>
+      </w:r>
+      <w:r>
+        <w:rPr>
+          <w:rtl/>
+        </w:rPr>
+        <w:br/>
       </w:r>
     </w:p>
     <w:p>
@@ -341,412 +693,398 @@
           <w:numId w:val="1"/>
         </w:numPr>
       </w:pPr>
-      <m:oMath>
-        <m:r>
-          <w:rPr>
-            <w:rFonts w:ascii="Cambria Math" w:hAnsi="Cambria Math"/>
-            <w:sz w:val="18"/>
-            <w:szCs w:val="18"/>
-          </w:rPr>
-          <m:t xml:space="preserve">New </m:t>
-        </m:r>
-        <m:r>
-          <w:rPr>
-            <w:rFonts w:ascii="Cambria Math" w:hAnsi="Cambria Math"/>
-            <w:sz w:val="18"/>
-            <w:szCs w:val="18"/>
-          </w:rPr>
-          <m:t>CPI=</m:t>
-        </m:r>
-        <m:nary>
-          <m:naryPr>
-            <m:chr m:val="∑"/>
-            <m:limLoc m:val="undOvr"/>
-            <m:subHide m:val="1"/>
-            <m:supHide m:val="1"/>
-            <m:ctrlPr>
-              <w:rPr>
-                <w:rFonts w:ascii="Cambria Math" w:hAnsi="Cambria Math"/>
-                <w:sz w:val="18"/>
-                <w:szCs w:val="18"/>
-              </w:rPr>
-            </m:ctrlPr>
-          </m:naryPr>
-          <m:sub/>
-          <m:sup/>
-          <m:e>
-            <m:r>
-              <w:rPr>
-                <w:rFonts w:ascii="Cambria Math" w:hAnsi="Cambria Math"/>
-                <w:sz w:val="18"/>
-                <w:szCs w:val="18"/>
-              </w:rPr>
-              <m:t>frequenc</m:t>
-            </m:r>
-            <m:sSub>
-              <m:sSubPr>
-                <m:ctrlPr>
-                  <w:rPr>
-                    <w:rFonts w:ascii="Cambria Math" w:hAnsi="Cambria Math"/>
-                    <w:i/>
-                    <w:sz w:val="18"/>
-                    <w:szCs w:val="18"/>
-                  </w:rPr>
-                </m:ctrlPr>
-              </m:sSubPr>
-              <m:e>
-                <m:r>
-                  <w:rPr>
-                    <w:rFonts w:ascii="Cambria Math" w:hAnsi="Cambria Math"/>
-                    <w:sz w:val="18"/>
-                    <w:szCs w:val="18"/>
-                  </w:rPr>
-                  <m:t>y</m:t>
-                </m:r>
-              </m:e>
-              <m:sub>
-                <m:r>
-                  <w:rPr>
-                    <w:rFonts w:ascii="Cambria Math" w:hAnsi="Cambria Math"/>
-                    <w:sz w:val="18"/>
-                    <w:szCs w:val="18"/>
-                  </w:rPr>
-                  <m:t>i</m:t>
-                </m:r>
-              </m:sub>
-            </m:sSub>
-            <m:r>
-              <w:rPr>
-                <w:rFonts w:ascii="Cambria Math" w:hAnsi="Cambria Math"/>
-                <w:sz w:val="18"/>
-                <w:szCs w:val="18"/>
-              </w:rPr>
-              <m:t>*clock</m:t>
-            </m:r>
-            <m:r>
-              <m:rPr>
-                <m:lit/>
-              </m:rPr>
-              <w:rPr>
-                <w:rFonts w:ascii="Cambria Math" w:hAnsi="Cambria Math"/>
-                <w:sz w:val="18"/>
-                <w:szCs w:val="18"/>
-              </w:rPr>
-              <m:t>_</m:t>
-            </m:r>
-            <m:r>
-              <w:rPr>
-                <w:rFonts w:ascii="Cambria Math" w:hAnsi="Cambria Math"/>
-                <w:sz w:val="18"/>
-                <w:szCs w:val="18"/>
-              </w:rPr>
-              <m:t>cycle</m:t>
-            </m:r>
-            <m:sSub>
-              <m:sSubPr>
-                <m:ctrlPr>
-                  <w:rPr>
-                    <w:rFonts w:ascii="Cambria Math" w:hAnsi="Cambria Math"/>
-                    <w:i/>
-                    <w:sz w:val="18"/>
-                    <w:szCs w:val="18"/>
-                  </w:rPr>
-                </m:ctrlPr>
-              </m:sSubPr>
-              <m:e>
-                <m:r>
-                  <w:rPr>
-                    <w:rFonts w:ascii="Cambria Math" w:hAnsi="Cambria Math"/>
-                    <w:sz w:val="18"/>
-                    <w:szCs w:val="18"/>
-                  </w:rPr>
-                  <m:t>s</m:t>
-                </m:r>
-              </m:e>
-              <m:sub>
-                <m:r>
-                  <w:rPr>
-                    <w:rFonts w:ascii="Cambria Math" w:hAnsi="Cambria Math"/>
-                    <w:sz w:val="18"/>
-                    <w:szCs w:val="18"/>
-                  </w:rPr>
-                  <m:t>i</m:t>
-                </m:r>
-              </m:sub>
-            </m:sSub>
-          </m:e>
-        </m:nary>
-        <m:r>
-          <w:rPr>
-            <w:rFonts w:ascii="Cambria Math" w:hAnsi="Cambria Math"/>
-            <w:sz w:val="18"/>
-            <w:szCs w:val="18"/>
-          </w:rPr>
-          <m:t>=</m:t>
-        </m:r>
-        <m:d>
-          <m:dPr>
-            <m:ctrlPr>
-              <w:rPr>
-                <w:rFonts w:ascii="Cambria Math" w:hAnsi="Cambria Math"/>
-                <w:i/>
-                <w:sz w:val="18"/>
-                <w:szCs w:val="18"/>
-              </w:rPr>
-            </m:ctrlPr>
-          </m:dPr>
-          <m:e>
-            <m:r>
-              <w:rPr>
-                <w:rFonts w:ascii="Cambria Math" w:hAnsi="Cambria Math"/>
-                <w:sz w:val="18"/>
-                <w:szCs w:val="18"/>
-              </w:rPr>
-              <m:t>0.5*1</m:t>
-            </m:r>
-            <m:r>
-              <w:rPr>
-                <w:rFonts w:ascii="Cambria Math" w:hAnsi="Cambria Math"/>
-                <w:sz w:val="18"/>
-                <w:szCs w:val="18"/>
-              </w:rPr>
-              <m:t>*1.5</m:t>
-            </m:r>
-          </m:e>
-        </m:d>
-        <m:r>
-          <w:rPr>
-            <w:rFonts w:ascii="Cambria Math" w:hAnsi="Cambria Math"/>
-            <w:sz w:val="18"/>
-            <w:szCs w:val="18"/>
-          </w:rPr>
-          <m:t>+</m:t>
-        </m:r>
-        <m:d>
-          <m:dPr>
-            <m:ctrlPr>
-              <w:rPr>
-                <w:rFonts w:ascii="Cambria Math" w:hAnsi="Cambria Math"/>
-                <w:i/>
-                <w:sz w:val="18"/>
-                <w:szCs w:val="18"/>
-              </w:rPr>
-            </m:ctrlPr>
-          </m:dPr>
-          <m:e>
-            <m:r>
-              <w:rPr>
-                <w:rFonts w:ascii="Cambria Math" w:hAnsi="Cambria Math"/>
-                <w:sz w:val="18"/>
-                <w:szCs w:val="18"/>
-              </w:rPr>
-              <m:t>0.15*</m:t>
-            </m:r>
-            <m:f>
-              <m:fPr>
-                <m:ctrlPr>
-                  <w:rPr>
-                    <w:rFonts w:ascii="Cambria Math" w:hAnsi="Cambria Math"/>
-                    <w:i/>
-                    <w:sz w:val="18"/>
-                    <w:szCs w:val="18"/>
-                  </w:rPr>
-                </m:ctrlPr>
-              </m:fPr>
-              <m:num>
-                <m:r>
-                  <w:rPr>
-                    <w:rFonts w:ascii="Cambria Math" w:hAnsi="Cambria Math"/>
-                    <w:sz w:val="18"/>
-                    <w:szCs w:val="18"/>
-                  </w:rPr>
-                  <m:t>5</m:t>
-                </m:r>
-              </m:num>
-              <m:den>
-                <m:r>
-                  <w:rPr>
-                    <w:rFonts w:ascii="Cambria Math" w:hAnsi="Cambria Math"/>
-                    <w:sz w:val="18"/>
-                    <w:szCs w:val="18"/>
-                  </w:rPr>
-                  <m:t>2</m:t>
-                </m:r>
-              </m:den>
-            </m:f>
-          </m:e>
-        </m:d>
-        <m:r>
-          <w:rPr>
-            <w:rFonts w:ascii="Cambria Math" w:hAnsi="Cambria Math"/>
-            <w:sz w:val="18"/>
-            <w:szCs w:val="18"/>
-          </w:rPr>
-          <m:t>+</m:t>
-        </m:r>
-        <m:d>
-          <m:dPr>
-            <m:ctrlPr>
-              <w:rPr>
-                <w:rFonts w:ascii="Cambria Math" w:hAnsi="Cambria Math"/>
-                <w:i/>
-                <w:sz w:val="18"/>
-                <w:szCs w:val="18"/>
-              </w:rPr>
-            </m:ctrlPr>
-          </m:dPr>
-          <m:e>
-            <m:r>
-              <w:rPr>
-                <w:rFonts w:ascii="Cambria Math" w:hAnsi="Cambria Math"/>
-                <w:sz w:val="18"/>
-                <w:szCs w:val="18"/>
-              </w:rPr>
-              <m:t>0.2*</m:t>
-            </m:r>
-            <m:f>
-              <m:fPr>
-                <m:ctrlPr>
-                  <w:rPr>
-                    <w:rFonts w:ascii="Cambria Math" w:hAnsi="Cambria Math"/>
-                    <w:i/>
-                    <w:sz w:val="18"/>
-                    <w:szCs w:val="18"/>
-                  </w:rPr>
-                </m:ctrlPr>
-              </m:fPr>
-              <m:num>
-                <m:r>
-                  <w:rPr>
-                    <w:rFonts w:ascii="Cambria Math" w:hAnsi="Cambria Math"/>
-                    <w:sz w:val="18"/>
-                    <w:szCs w:val="18"/>
-                  </w:rPr>
-                  <m:t>4</m:t>
-                </m:r>
-              </m:num>
-              <m:den>
-                <m:r>
-                  <w:rPr>
-                    <w:rFonts w:ascii="Cambria Math" w:hAnsi="Cambria Math"/>
-                    <w:sz w:val="18"/>
-                    <w:szCs w:val="18"/>
-                  </w:rPr>
-                  <m:t>3</m:t>
-                </m:r>
-              </m:den>
-            </m:f>
-          </m:e>
-        </m:d>
-        <m:r>
-          <w:rPr>
-            <w:rFonts w:ascii="Cambria Math" w:hAnsi="Cambria Math"/>
-            <w:sz w:val="18"/>
-            <w:szCs w:val="18"/>
-          </w:rPr>
-          <m:t>+</m:t>
-        </m:r>
-        <m:d>
-          <m:dPr>
-            <m:ctrlPr>
-              <w:rPr>
-                <w:rFonts w:ascii="Cambria Math" w:hAnsi="Cambria Math"/>
-                <w:i/>
-                <w:sz w:val="18"/>
-                <w:szCs w:val="18"/>
-              </w:rPr>
-            </m:ctrlPr>
-          </m:dPr>
-          <m:e>
-            <m:r>
-              <w:rPr>
-                <w:rFonts w:ascii="Cambria Math" w:hAnsi="Cambria Math"/>
-                <w:sz w:val="18"/>
-                <w:szCs w:val="18"/>
-              </w:rPr>
-              <m:t>0.15*2</m:t>
-            </m:r>
-          </m:e>
-        </m:d>
-        <m:r>
-          <w:rPr>
-            <w:rFonts w:ascii="Cambria Math" w:eastAsiaTheme="minorEastAsia" w:hAnsi="Cambria Math"/>
-            <w:sz w:val="18"/>
-            <w:szCs w:val="18"/>
-          </w:rPr>
-          <m:t>=</m:t>
-        </m:r>
-        <m:r>
-          <w:rPr>
-            <w:rFonts w:ascii="Cambria Math" w:hAnsi="Cambria Math"/>
-            <w:sz w:val="18"/>
-            <w:szCs w:val="18"/>
-          </w:rPr>
-          <m:t>0.</m:t>
-        </m:r>
-        <m:r>
-          <w:rPr>
-            <w:rFonts w:ascii="Cambria Math" w:hAnsi="Cambria Math"/>
-            <w:sz w:val="18"/>
-            <w:szCs w:val="18"/>
-          </w:rPr>
-          <m:t>7</m:t>
-        </m:r>
-        <m:r>
-          <w:rPr>
-            <w:rFonts w:ascii="Cambria Math" w:hAnsi="Cambria Math"/>
-            <w:sz w:val="18"/>
-            <w:szCs w:val="18"/>
-          </w:rPr>
-          <m:t>5+0.</m:t>
-        </m:r>
-        <m:r>
-          <w:rPr>
-            <w:rFonts w:ascii="Cambria Math" w:hAnsi="Cambria Math"/>
-            <w:sz w:val="18"/>
-            <w:szCs w:val="18"/>
-          </w:rPr>
-          <m:t>375</m:t>
-        </m:r>
-        <m:r>
-          <w:rPr>
-            <w:rFonts w:ascii="Cambria Math" w:hAnsi="Cambria Math"/>
-            <w:sz w:val="18"/>
-            <w:szCs w:val="18"/>
-          </w:rPr>
-          <m:t>+0.</m:t>
-        </m:r>
-        <m:r>
-          <w:rPr>
-            <w:rFonts w:ascii="Cambria Math" w:hAnsi="Cambria Math"/>
-            <w:sz w:val="18"/>
-            <w:szCs w:val="18"/>
-          </w:rPr>
-          <m:t>266</m:t>
-        </m:r>
-        <m:r>
-          <w:rPr>
-            <w:rFonts w:ascii="Cambria Math" w:hAnsi="Cambria Math"/>
-            <w:sz w:val="18"/>
-            <w:szCs w:val="18"/>
-          </w:rPr>
-          <m:t>+0.3=</m:t>
-        </m:r>
-        <m:r>
-          <w:rPr>
-            <w:rFonts w:ascii="Cambria Math" w:hAnsi="Cambria Math"/>
-            <w:sz w:val="18"/>
-            <w:szCs w:val="18"/>
-          </w:rPr>
-          <m:t>1.691</m:t>
-        </m:r>
-      </m:oMath>
-      <w:r>
-        <w:rPr>
-          <w:rtl/>
-        </w:rPr>
-        <w:br/>
-      </w:r>
+    </w:p>
+    <w:p>
+      <w:pPr>
+        <w:pStyle w:val="a9"/>
+      </w:pPr>
+      <m:oMathPara>
+        <m:oMathParaPr>
+          <m:jc m:val="center"/>
+        </m:oMathParaPr>
+        <m:oMath>
+          <m:r>
+            <w:rPr>
+              <w:rFonts w:ascii="Cambria Math" w:hAnsi="Cambria Math"/>
+              <w:sz w:val="18"/>
+              <w:szCs w:val="18"/>
+            </w:rPr>
+            <m:t>New CPI=</m:t>
+          </m:r>
+          <m:nary>
+            <m:naryPr>
+              <m:chr m:val="∑"/>
+              <m:limLoc m:val="undOvr"/>
+              <m:subHide m:val="1"/>
+              <m:supHide m:val="1"/>
+              <m:ctrlPr>
+                <w:rPr>
+                  <w:rFonts w:ascii="Cambria Math" w:hAnsi="Cambria Math"/>
+                  <w:sz w:val="18"/>
+                  <w:szCs w:val="18"/>
+                </w:rPr>
+              </m:ctrlPr>
+            </m:naryPr>
+            <m:sub/>
+            <m:sup/>
+            <m:e>
+              <m:r>
+                <w:rPr>
+                  <w:rFonts w:ascii="Cambria Math" w:hAnsi="Cambria Math"/>
+                  <w:sz w:val="18"/>
+                  <w:szCs w:val="18"/>
+                </w:rPr>
+                <m:t>frequenc</m:t>
+              </m:r>
+              <m:sSub>
+                <m:sSubPr>
+                  <m:ctrlPr>
+                    <w:rPr>
+                      <w:rFonts w:ascii="Cambria Math" w:hAnsi="Cambria Math"/>
+                      <w:i/>
+                      <w:sz w:val="18"/>
+                      <w:szCs w:val="18"/>
+                    </w:rPr>
+                  </m:ctrlPr>
+                </m:sSubPr>
+                <m:e>
+                  <m:r>
+                    <w:rPr>
+                      <w:rFonts w:ascii="Cambria Math" w:hAnsi="Cambria Math"/>
+                      <w:sz w:val="18"/>
+                      <w:szCs w:val="18"/>
+                    </w:rPr>
+                    <m:t>y</m:t>
+                  </m:r>
+                </m:e>
+                <m:sub>
+                  <m:r>
+                    <w:rPr>
+                      <w:rFonts w:ascii="Cambria Math" w:hAnsi="Cambria Math"/>
+                      <w:sz w:val="18"/>
+                      <w:szCs w:val="18"/>
+                    </w:rPr>
+                    <m:t>i</m:t>
+                  </m:r>
+                </m:sub>
+              </m:sSub>
+              <m:r>
+                <w:rPr>
+                  <w:rFonts w:ascii="Cambria Math" w:hAnsi="Cambria Math"/>
+                  <w:sz w:val="18"/>
+                  <w:szCs w:val="18"/>
+                </w:rPr>
+                <m:t>*clock</m:t>
+              </m:r>
+              <m:r>
+                <m:rPr>
+                  <m:lit/>
+                </m:rPr>
+                <w:rPr>
+                  <w:rFonts w:ascii="Cambria Math" w:hAnsi="Cambria Math"/>
+                  <w:sz w:val="18"/>
+                  <w:szCs w:val="18"/>
+                </w:rPr>
+                <m:t>_</m:t>
+              </m:r>
+              <m:r>
+                <w:rPr>
+                  <w:rFonts w:ascii="Cambria Math" w:hAnsi="Cambria Math"/>
+                  <w:sz w:val="18"/>
+                  <w:szCs w:val="18"/>
+                </w:rPr>
+                <m:t>cycle</m:t>
+              </m:r>
+              <m:sSub>
+                <m:sSubPr>
+                  <m:ctrlPr>
+                    <w:rPr>
+                      <w:rFonts w:ascii="Cambria Math" w:hAnsi="Cambria Math"/>
+                      <w:i/>
+                      <w:sz w:val="18"/>
+                      <w:szCs w:val="18"/>
+                    </w:rPr>
+                  </m:ctrlPr>
+                </m:sSubPr>
+                <m:e>
+                  <m:r>
+                    <w:rPr>
+                      <w:rFonts w:ascii="Cambria Math" w:hAnsi="Cambria Math"/>
+                      <w:sz w:val="18"/>
+                      <w:szCs w:val="18"/>
+                    </w:rPr>
+                    <m:t>s</m:t>
+                  </m:r>
+                </m:e>
+                <m:sub>
+                  <m:r>
+                    <w:rPr>
+                      <w:rFonts w:ascii="Cambria Math" w:hAnsi="Cambria Math"/>
+                      <w:sz w:val="18"/>
+                      <w:szCs w:val="18"/>
+                    </w:rPr>
+                    <m:t>i</m:t>
+                  </m:r>
+                </m:sub>
+              </m:sSub>
+            </m:e>
+          </m:nary>
+          <m:r>
+            <w:rPr>
+              <w:rFonts w:ascii="Cambria Math" w:hAnsi="Cambria Math"/>
+              <w:sz w:val="18"/>
+              <w:szCs w:val="18"/>
+            </w:rPr>
+            <m:t>=</m:t>
+          </m:r>
+          <m:r>
+            <w:rPr>
+              <w:rFonts w:ascii="Cambria Math" w:hAnsi="Cambria Math"/>
+              <w:sz w:val="18"/>
+              <w:szCs w:val="18"/>
+            </w:rPr>
+            <w:br/>
+          </m:r>
+        </m:oMath>
+        <m:oMath>
+          <m:d>
+            <m:dPr>
+              <m:ctrlPr>
+                <w:rPr>
+                  <w:rFonts w:ascii="Cambria Math" w:hAnsi="Cambria Math"/>
+                  <w:i/>
+                  <w:sz w:val="18"/>
+                  <w:szCs w:val="18"/>
+                </w:rPr>
+              </m:ctrlPr>
+            </m:dPr>
+            <m:e>
+              <m:r>
+                <w:rPr>
+                  <w:rFonts w:ascii="Cambria Math" w:hAnsi="Cambria Math"/>
+                  <w:sz w:val="18"/>
+                  <w:szCs w:val="18"/>
+                </w:rPr>
+                <m:t>0.5*1*1.5</m:t>
+              </m:r>
+            </m:e>
+          </m:d>
+          <m:r>
+            <w:rPr>
+              <w:rFonts w:ascii="Cambria Math" w:hAnsi="Cambria Math"/>
+              <w:sz w:val="18"/>
+              <w:szCs w:val="18"/>
+            </w:rPr>
+            <m:t>+</m:t>
+          </m:r>
+          <m:d>
+            <m:dPr>
+              <m:ctrlPr>
+                <w:rPr>
+                  <w:rFonts w:ascii="Cambria Math" w:hAnsi="Cambria Math"/>
+                  <w:i/>
+                  <w:sz w:val="18"/>
+                  <w:szCs w:val="18"/>
+                </w:rPr>
+              </m:ctrlPr>
+            </m:dPr>
+            <m:e>
+              <m:r>
+                <w:rPr>
+                  <w:rFonts w:ascii="Cambria Math" w:hAnsi="Cambria Math"/>
+                  <w:sz w:val="18"/>
+                  <w:szCs w:val="18"/>
+                </w:rPr>
+                <m:t>0.15*</m:t>
+              </m:r>
+              <m:f>
+                <m:fPr>
+                  <m:ctrlPr>
+                    <w:rPr>
+                      <w:rFonts w:ascii="Cambria Math" w:hAnsi="Cambria Math"/>
+                      <w:i/>
+                      <w:sz w:val="18"/>
+                      <w:szCs w:val="18"/>
+                    </w:rPr>
+                  </m:ctrlPr>
+                </m:fPr>
+                <m:num>
+                  <m:r>
+                    <w:rPr>
+                      <w:rFonts w:ascii="Cambria Math" w:hAnsi="Cambria Math"/>
+                      <w:sz w:val="18"/>
+                      <w:szCs w:val="18"/>
+                    </w:rPr>
+                    <m:t>5</m:t>
+                  </m:r>
+                </m:num>
+                <m:den>
+                  <m:r>
+                    <w:rPr>
+                      <w:rFonts w:ascii="Cambria Math" w:hAnsi="Cambria Math"/>
+                      <w:sz w:val="18"/>
+                      <w:szCs w:val="18"/>
+                    </w:rPr>
+                    <m:t>2</m:t>
+                  </m:r>
+                </m:den>
+              </m:f>
+            </m:e>
+          </m:d>
+          <m:r>
+            <w:rPr>
+              <w:rFonts w:ascii="Cambria Math" w:hAnsi="Cambria Math"/>
+              <w:sz w:val="18"/>
+              <w:szCs w:val="18"/>
+            </w:rPr>
+            <m:t>+</m:t>
+          </m:r>
+          <m:d>
+            <m:dPr>
+              <m:ctrlPr>
+                <w:rPr>
+                  <w:rFonts w:ascii="Cambria Math" w:hAnsi="Cambria Math"/>
+                  <w:i/>
+                  <w:sz w:val="18"/>
+                  <w:szCs w:val="18"/>
+                </w:rPr>
+              </m:ctrlPr>
+            </m:dPr>
+            <m:e>
+              <m:r>
+                <w:rPr>
+                  <w:rFonts w:ascii="Cambria Math" w:hAnsi="Cambria Math"/>
+                  <w:sz w:val="18"/>
+                  <w:szCs w:val="18"/>
+                </w:rPr>
+                <m:t>0.2*</m:t>
+              </m:r>
+              <m:f>
+                <m:fPr>
+                  <m:ctrlPr>
+                    <w:rPr>
+                      <w:rFonts w:ascii="Cambria Math" w:hAnsi="Cambria Math"/>
+                      <w:i/>
+                      <w:sz w:val="18"/>
+                      <w:szCs w:val="18"/>
+                    </w:rPr>
+                  </m:ctrlPr>
+                </m:fPr>
+                <m:num>
+                  <m:r>
+                    <w:rPr>
+                      <w:rFonts w:ascii="Cambria Math" w:hAnsi="Cambria Math"/>
+                      <w:sz w:val="18"/>
+                      <w:szCs w:val="18"/>
+                    </w:rPr>
+                    <m:t>4</m:t>
+                  </m:r>
+                </m:num>
+                <m:den>
+                  <m:r>
+                    <w:rPr>
+                      <w:rFonts w:ascii="Cambria Math" w:hAnsi="Cambria Math"/>
+                      <w:sz w:val="18"/>
+                      <w:szCs w:val="18"/>
+                    </w:rPr>
+                    <m:t>3</m:t>
+                  </m:r>
+                </m:den>
+              </m:f>
+            </m:e>
+          </m:d>
+          <m:r>
+            <w:rPr>
+              <w:rFonts w:ascii="Cambria Math" w:hAnsi="Cambria Math"/>
+              <w:sz w:val="18"/>
+              <w:szCs w:val="18"/>
+            </w:rPr>
+            <m:t>+</m:t>
+          </m:r>
+          <m:d>
+            <m:dPr>
+              <m:ctrlPr>
+                <w:rPr>
+                  <w:rFonts w:ascii="Cambria Math" w:hAnsi="Cambria Math"/>
+                  <w:i/>
+                  <w:sz w:val="18"/>
+                  <w:szCs w:val="18"/>
+                </w:rPr>
+              </m:ctrlPr>
+            </m:dPr>
+            <m:e>
+              <m:r>
+                <w:rPr>
+                  <w:rFonts w:ascii="Cambria Math" w:hAnsi="Cambria Math"/>
+                  <w:sz w:val="18"/>
+                  <w:szCs w:val="18"/>
+                </w:rPr>
+                <m:t>0.15*2</m:t>
+              </m:r>
+            </m:e>
+          </m:d>
+          <m:r>
+            <w:rPr>
+              <w:rFonts w:ascii="Cambria Math" w:eastAsiaTheme="minorEastAsia" w:hAnsi="Cambria Math"/>
+              <w:sz w:val="18"/>
+              <w:szCs w:val="18"/>
+            </w:rPr>
+            <m:t>=</m:t>
+          </m:r>
+          <m:r>
+            <w:rPr>
+              <w:rFonts w:ascii="Cambria Math" w:eastAsiaTheme="minorEastAsia" w:hAnsi="Cambria Math"/>
+              <w:sz w:val="18"/>
+              <w:szCs w:val="18"/>
+            </w:rPr>
+            <w:br/>
+          </m:r>
+        </m:oMath>
+        <m:oMath>
+          <m:r>
+            <w:rPr>
+              <w:rFonts w:ascii="Cambria Math" w:hAnsi="Cambria Math"/>
+              <w:sz w:val="18"/>
+              <w:szCs w:val="18"/>
+            </w:rPr>
+            <m:t>0.75+0.375+0.266+0.3=</m:t>
+          </m:r>
+          <m:r>
+            <m:rPr>
+              <m:sty m:val="bi"/>
+            </m:rPr>
+            <w:rPr>
+              <w:rFonts w:ascii="Cambria Math" w:hAnsi="Cambria Math"/>
+              <w:sz w:val="18"/>
+              <w:szCs w:val="18"/>
+            </w:rPr>
+            <m:t>1.69</m:t>
+          </m:r>
+          <m:r>
+            <m:rPr>
+              <m:sty m:val="bi"/>
+            </m:rPr>
+            <w:rPr>
+              <w:rFonts w:ascii="Cambria Math" w:hAnsi="Cambria Math"/>
+              <w:sz w:val="18"/>
+              <w:szCs w:val="18"/>
+            </w:rPr>
+            <m:t>1</m:t>
+          </m:r>
+          <m:r>
+            <w:rPr>
+              <w:rtl/>
+            </w:rPr>
+            <w:br/>
+          </m:r>
+          <m:r>
+            <w:rPr>
+              <w:rtl/>
+            </w:rPr>
+            <w:br/>
+          </m:r>
+        </m:oMath>
+      </m:oMathPara>
       <w:r>
         <w:rPr>
           <w:rFonts w:hint="cs"/>
@@ -878,6 +1216,12 @@
           <m:t>=~1.39</m:t>
         </m:r>
       </m:oMath>
+      <w:r>
+        <w:rPr>
+          <w:rtl/>
+        </w:rPr>
+        <w:br/>
+      </w:r>
     </w:p>
     <w:p>
       <w:pPr>
@@ -886,9 +1230,6 @@
           <w:ilvl w:val="0"/>
           <w:numId w:val="1"/>
         </w:numPr>
-        <w:rPr>
-          <w:rFonts w:hint="cs"/>
-        </w:rPr>
       </w:pPr>
       <w:r>
         <w:rPr>
@@ -905,7 +1246,21 @@
           <w:rFonts w:hint="cs"/>
           <w:rtl/>
         </w:rPr>
-        <w:t xml:space="preserve"> בתוכנית מהקומפיילר החדש:</w:t>
+        <w:t xml:space="preserve"> בתוכנית מהקומפיילר החדש</w:t>
+      </w:r>
+      <w:r>
+        <w:rPr>
+          <w:rFonts w:hint="cs"/>
+          <w:rtl/>
+        </w:rPr>
+        <w:t xml:space="preserve"> (תחת ההנחה שמשתמשים במעבד החדש עבור אותה התוכנית בשני הקומפיילרים)</w:t>
+      </w:r>
+      <w:r>
+        <w:rPr>
+          <w:rFonts w:hint="cs"/>
+          <w:rtl/>
+        </w:rPr>
+        <w:t>:</w:t>
       </w:r>
       <w:r>
         <w:rPr>
@@ -914,6 +1269,9 @@
         <w:br/>
       </w:r>
       <m:oMathPara>
+        <m:oMathParaPr>
+          <m:jc m:val="center"/>
+        </m:oMathParaPr>
         <m:oMath>
           <m:r>
             <w:rPr>
@@ -1049,6 +1407,16 @@
             </w:rPr>
             <m:t>=</m:t>
           </m:r>
+          <m:r>
+            <w:rPr>
+              <w:rFonts w:ascii="Cambria Math" w:hAnsi="Cambria Math"/>
+              <w:sz w:val="20"/>
+              <w:szCs w:val="20"/>
+            </w:rPr>
+            <w:br/>
+          </m:r>
+        </m:oMath>
+        <m:oMath>
           <m:d>
             <m:dPr>
               <m:ctrlPr>
@@ -1067,31 +1435,7 @@
                   <w:sz w:val="20"/>
                   <w:szCs w:val="20"/>
                 </w:rPr>
-                <m:t>0.</m:t>
-              </m:r>
-              <m:r>
-                <w:rPr>
-                  <w:rFonts w:ascii="Cambria Math" w:hAnsi="Cambria Math"/>
-                  <w:sz w:val="20"/>
-                  <w:szCs w:val="20"/>
-                </w:rPr>
-                <m:t>3</m:t>
-              </m:r>
-              <m:r>
-                <w:rPr>
-                  <w:rFonts w:ascii="Cambria Math" w:hAnsi="Cambria Math"/>
-                  <w:sz w:val="20"/>
-                  <w:szCs w:val="20"/>
-                </w:rPr>
-                <m:t>*1</m:t>
-              </m:r>
-              <m:r>
-                <w:rPr>
-                  <w:rFonts w:ascii="Cambria Math" w:hAnsi="Cambria Math"/>
-                  <w:sz w:val="20"/>
-                  <w:szCs w:val="20"/>
-                </w:rPr>
-                <m:t>.5</m:t>
+                <m:t>0.3*1.5</m:t>
               </m:r>
             </m:e>
           </m:d>
@@ -1183,23 +1527,7 @@
                   <w:sz w:val="20"/>
                   <w:szCs w:val="20"/>
                 </w:rPr>
-                <m:t>0.</m:t>
-              </m:r>
-              <m:r>
-                <w:rPr>
-                  <w:rFonts w:ascii="Cambria Math" w:hAnsi="Cambria Math"/>
-                  <w:sz w:val="20"/>
-                  <w:szCs w:val="20"/>
-                </w:rPr>
-                <m:t>4</m:t>
-              </m:r>
-              <m:r>
-                <w:rPr>
-                  <w:rFonts w:ascii="Cambria Math" w:hAnsi="Cambria Math"/>
-                  <w:sz w:val="20"/>
-                  <w:szCs w:val="20"/>
-                </w:rPr>
-                <m:t>*</m:t>
+                <m:t>0.4*</m:t>
               </m:r>
               <m:f>
                 <m:fPr>
@@ -1279,17 +1607,22 @@
               <w:sz w:val="20"/>
               <w:szCs w:val="20"/>
             </w:rPr>
-            <m:t>0.45+0.375+0.533+0.3</m:t>
-          </m:r>
+            <w:br/>
+          </m:r>
+        </m:oMath>
+        <m:oMath>
           <m:r>
             <w:rPr>
               <w:rFonts w:ascii="Cambria Math" w:hAnsi="Cambria Math"/>
               <w:sz w:val="20"/>
               <w:szCs w:val="20"/>
             </w:rPr>
-            <m:t>=</m:t>
-          </m:r>
-          <m:r>
+            <m:t>0.45+0.375+0.533+0.3=</m:t>
+          </m:r>
+          <m:r>
+            <m:rPr>
+              <m:sty m:val="bi"/>
+            </m:rPr>
             <w:rPr>
               <w:rFonts w:ascii="Cambria Math" w:hAnsi="Cambria Math"/>
               <w:sz w:val="20"/>
@@ -1298,6 +1631,9 @@
             <m:t>1.658</m:t>
           </m:r>
           <m:r>
+            <m:rPr>
+              <m:sty m:val="p"/>
+            </m:rPr>
             <w:rPr>
               <w:rFonts w:eastAsiaTheme="minorEastAsia"/>
               <w:sz w:val="20"/>
@@ -1307,6 +1643,15 @@
           </m:r>
         </m:oMath>
       </m:oMathPara>
+      <w:r>
+        <w:rPr>
+          <w:rFonts w:eastAsiaTheme="minorEastAsia"/>
+          <w:sz w:val="20"/>
+          <w:szCs w:val="20"/>
+          <w:rtl/>
+        </w:rPr>
+        <w:br/>
+      </w:r>
       <w:r>
         <w:rPr>
           <w:rFonts w:eastAsiaTheme="minorEastAsia" w:hint="cs"/>
@@ -1320,10 +1665,18 @@
         <m:r>
           <w:rPr>
             <w:rFonts w:ascii="Cambria Math" w:eastAsiaTheme="minorEastAsia" w:hAnsi="Cambria Math"/>
-            <w:sz w:val="20"/>
-            <w:szCs w:val="20"/>
+            <w:sz w:val="16"/>
+            <w:szCs w:val="16"/>
           </w:rPr>
-          <m:t>x=instruction count</m:t>
+          <m:t>x=instruction co</m:t>
+        </m:r>
+        <m:r>
+          <w:rPr>
+            <w:rFonts w:ascii="Cambria Math" w:eastAsiaTheme="minorEastAsia" w:hAnsi="Cambria Math"/>
+            <w:sz w:val="16"/>
+            <w:szCs w:val="16"/>
+          </w:rPr>
+          <m:t>unt*cycle time</m:t>
         </m:r>
       </m:oMath>
       <w:r>
@@ -1345,6 +1698,7 @@
             <w:rPr>
               <w:rFonts w:ascii="Cambria Math" w:hAnsi="Cambria Math"/>
             </w:rPr>
+            <w:lastRenderedPageBreak/>
             <m:t>CPU</m:t>
           </m:r>
           <m:r>
@@ -1392,13 +1746,7 @@
             <w:rPr>
               <w:rFonts w:ascii="Cambria Math" w:hAnsi="Cambria Math"/>
             </w:rPr>
-            <m:t>=</m:t>
-          </m:r>
-          <m:r>
-            <w:rPr>
-              <w:rFonts w:ascii="Cambria Math" w:hAnsi="Cambria Math"/>
-            </w:rPr>
-            <m:t>CP</m:t>
+            <m:t>=CP</m:t>
           </m:r>
           <m:sSub>
             <m:sSubPr>
@@ -1430,21 +1778,12 @@
             <w:rPr>
               <w:rFonts w:ascii="Cambria Math" w:hAnsi="Cambria Math"/>
             </w:rPr>
-            <m:t>*x=</m:t>
-          </m:r>
-          <m:r>
-            <w:rPr>
-              <w:rFonts w:ascii="Cambria Math" w:hAnsi="Cambria Math"/>
-            </w:rPr>
-            <m:t>1.691</m:t>
-          </m:r>
-          <m:r>
-            <w:rPr>
-              <w:rFonts w:ascii="Cambria Math" w:hAnsi="Cambria Math"/>
-            </w:rPr>
-            <m:t>x</m:t>
-          </m:r>
-          <m:r>
+            <m:t>*x=1.691x</m:t>
+          </m:r>
+          <m:r>
+            <m:rPr>
+              <m:sty m:val="p"/>
+            </m:rPr>
             <w:rPr>
               <w:rFonts w:ascii="Cambria Math" w:hAnsi="Cambria Math"/>
             </w:rPr>
@@ -1541,21 +1880,12 @@
             <w:rPr>
               <w:rFonts w:ascii="Cambria Math" w:eastAsiaTheme="minorEastAsia" w:hAnsi="Cambria Math"/>
             </w:rPr>
-            <m:t>*0.8*x=</m:t>
-          </m:r>
-          <m:r>
-            <w:rPr>
-              <w:rFonts w:ascii="Cambria Math" w:eastAsiaTheme="minorEastAsia" w:hAnsi="Cambria Math"/>
-            </w:rPr>
-            <m:t>1.326</m:t>
-          </m:r>
-          <m:r>
-            <w:rPr>
-              <w:rFonts w:ascii="Cambria Math" w:eastAsiaTheme="minorEastAsia" w:hAnsi="Cambria Math"/>
-            </w:rPr>
-            <m:t>x</m:t>
-          </m:r>
-          <m:r>
+            <m:t>*0.8*x=1.326x</m:t>
+          </m:r>
+          <m:r>
+            <m:rPr>
+              <m:sty m:val="p"/>
+            </m:rPr>
             <w:rPr>
               <w:rFonts w:eastAsiaTheme="minorEastAsia"/>
             </w:rPr>
@@ -1582,6 +1912,194 @@
           <w:rtl/>
         </w:rPr>
         <w:t xml:space="preserve"> מכיוון שהוא מריץ את התוכנית על המעבד החדש מהר יותר מאשר הקומפיילר הרגיל.</w:t>
+      </w:r>
+    </w:p>
+    <w:p>
+      <w:pPr>
+        <w:rPr>
+          <w:rtl/>
+        </w:rPr>
+      </w:pPr>
+    </w:p>
+    <w:p>
+      <w:pPr>
+        <w:rPr>
+          <w:b/>
+          <w:bCs/>
+          <w:u w:val="single"/>
+          <w:rtl/>
+        </w:rPr>
+      </w:pPr>
+      <w:r>
+        <w:rPr>
+          <w:rFonts w:hint="cs"/>
+          <w:b/>
+          <w:bCs/>
+          <w:u w:val="single"/>
+          <w:rtl/>
+        </w:rPr>
+        <w:t xml:space="preserve">שאלה </w:t>
+      </w:r>
+      <w:r>
+        <w:rPr>
+          <w:rFonts w:hint="cs"/>
+          <w:b/>
+          <w:bCs/>
+          <w:u w:val="single"/>
+          <w:rtl/>
+        </w:rPr>
+        <w:t>2</w:t>
+      </w:r>
+      <w:r>
+        <w:rPr>
+          <w:rFonts w:hint="cs"/>
+          <w:b/>
+          <w:bCs/>
+          <w:u w:val="single"/>
+          <w:rtl/>
+        </w:rPr>
+        <w:t>:</w:t>
+      </w:r>
+    </w:p>
+    <w:p>
+      <w:pPr>
+        <w:pStyle w:val="a9"/>
+        <w:numPr>
+          <w:ilvl w:val="0"/>
+          <w:numId w:val="2"/>
+        </w:numPr>
+      </w:pPr>
+      <w:r>
+        <w:rPr>
+          <w:rFonts w:hint="cs"/>
+          <w:rtl/>
+        </w:rPr>
+        <w:t xml:space="preserve">הבעיה תקרה כאשר נרצה להריץ פקודת </w:t>
+      </w:r>
+      <w:r>
+        <w:t>R-type</w:t>
+      </w:r>
+      <w:r>
+        <w:rPr>
+          <w:rFonts w:hint="cs"/>
+          <w:rtl/>
+        </w:rPr>
+        <w:t xml:space="preserve"> או </w:t>
+      </w:r>
+      <w:r>
+        <w:t>I-type</w:t>
+      </w:r>
+      <w:r>
+        <w:rPr>
+          <w:rFonts w:hint="cs"/>
+          <w:rtl/>
+        </w:rPr>
+        <w:t xml:space="preserve"> כמו למשל </w:t>
+      </w:r>
+      <w:proofErr w:type="spellStart"/>
+      <w:r>
+        <w:t>addi,sub,mu</w:t>
+      </w:r>
+      <w:r>
+        <w:t>l</w:t>
+      </w:r>
+      <w:r>
+        <w:t>,xor</w:t>
+      </w:r>
+      <w:proofErr w:type="spellEnd"/>
+      <w:r>
+        <w:rPr>
+          <w:rFonts w:hint="cs"/>
+          <w:rtl/>
+        </w:rPr>
+        <w:t xml:space="preserve"> שכותבת את התוצאה שלה לתוך אוגר (נסמן כ"פקודה (1)"), ו3 שורות אחריה נכתוב פקודת </w:t>
+      </w:r>
+      <w:r>
+        <w:t>R-type</w:t>
+      </w:r>
+      <w:r>
+        <w:rPr>
+          <w:rFonts w:hint="cs"/>
+          <w:rtl/>
+        </w:rPr>
+        <w:t xml:space="preserve"> נוספת שמקבלת אוגר כפרמטר וצריכה לבצע עליו פעולה, למשל חיבור, כפל, וכו' (נסמן כ"פקודה (2)"). </w:t>
+      </w:r>
+      <w:r>
+        <w:rPr>
+          <w:rtl/>
+        </w:rPr>
+        <w:br/>
+      </w:r>
+      <w:r>
+        <w:rPr>
+          <w:rFonts w:hint="cs"/>
+          <w:rtl/>
+        </w:rPr>
+        <w:t>זאת מכיוון שבמחזור השעון שבו הפקודה (1) תהיה בשלב ה</w:t>
+      </w:r>
+      <w:r>
+        <w:t>WB</w:t>
+      </w:r>
+      <w:r>
+        <w:rPr>
+          <w:rFonts w:hint="cs"/>
+          <w:rtl/>
+        </w:rPr>
+        <w:t xml:space="preserve">, הפקודה (2) תהיה בשלב </w:t>
+      </w:r>
+      <w:r>
+        <w:t>ID</w:t>
+      </w:r>
+      <w:r>
+        <w:rPr>
+          <w:rFonts w:hint="cs"/>
+          <w:rtl/>
+        </w:rPr>
+        <w:t xml:space="preserve"> ולכן באותו מחזור השעון המעבד יצטרך לכתוב בחזרה את הערך שחושב בפקודה (1) לאוגר וגם לקרוא מאוגר בשביל פקודה (2), מה שלפי נתוני </w:t>
+      </w:r>
+      <w:r>
+        <w:rPr>
+          <w:rFonts w:hint="cs"/>
+          <w:rtl/>
+        </w:rPr>
+        <w:t>ה</w:t>
+      </w:r>
+      <w:r>
+        <w:rPr>
+          <w:rFonts w:hint="cs"/>
+          <w:rtl/>
+        </w:rPr>
+        <w:t xml:space="preserve">שאלה </w:t>
+      </w:r>
+      <w:r>
+        <w:rPr>
+          <w:rFonts w:hint="cs"/>
+          <w:rtl/>
+        </w:rPr>
+        <w:t>לא אפשרי ולכן לא נוכל לבצע את הפקודות במקביל</w:t>
+      </w:r>
+      <w:r>
+        <w:rPr>
+          <w:rFonts w:hint="cs"/>
+          <w:rtl/>
+        </w:rPr>
+        <w:t>.</w:t>
+      </w:r>
+    </w:p>
+    <w:p>
+      <w:pPr>
+        <w:pStyle w:val="a9"/>
+        <w:numPr>
+          <w:ilvl w:val="0"/>
+          <w:numId w:val="2"/>
+        </w:numPr>
+      </w:pPr>
+      <w:r>
+        <w:rPr>
+          <w:rFonts w:hint="cs"/>
+          <w:rtl/>
+        </w:rPr>
+        <w:t xml:space="preserve"> </w:t>
       </w:r>
     </w:p>
     <w:sectPr>
@@ -1599,10 +2117,10 @@
 <file path=word/numbering.xml><?xml version="1.0" encoding="utf-8"?>
 <w:numbering xmlns:wpc="http://schemas.microsoft.com/office/word/2010/wordprocessingCanvas" xmlns:cx="http://schemas.microsoft.com/office/drawing/2014/chartex" xmlns:cx1="http://schemas.microsoft.com/office/drawing/2015/9/8/chartex" xmlns:cx2="http://schemas.microsoft.com/office/drawing/2015/10/21/chartex" xmlns:cx3="http://schemas.microsoft.com/office/drawing/2016/5/9/chartex" xmlns:cx4="http://schemas.microsoft.com/office/drawing/2016/5/10/chartex" xmlns:cx5="http://schemas.microsoft.com/office/drawing/2016/5/11/chartex" xmlns:cx6="http://schemas.microsoft.com/office/drawing/2016/5/12/chartex" xmlns:cx7="http://schemas.microsoft.com/office/drawing/2016/5/13/chartex" xmlns:cx8="http://schemas.microsoft.com/office/drawing/2016/5/14/chartex" xmlns:mc="http://schemas.openxmlformats.org/markup-compatibility/2006" xmlns:aink="http://schemas.microsoft.com/office/drawing/2016/ink" xmlns:am3d="http://schemas.microsoft.com/office/drawing/2017/model3d" xmlns:o="urn:schemas-microsoft-com:office:office" xmlns:oel="http://schemas.microsoft.com/office/2019/extlst" xmlns:r="http://schemas.openxmlformats.org/officeDocument/2006/relationships" xmlns:m="http://schemas.openxmlformats.org/officeDocument/2006/math" xmlns:v="urn:schemas-microsoft-com:vml" xmlns:wp14="http://schemas.microsoft.com/office/word/2010/wordprocessingDrawing" xmlns:wp="http://schemas.openxmlformats.org/drawingml/2006/wordprocessingDrawing" xmlns:w10="urn:schemas-microsoft-com:office:word" xmlns:w="http://schemas.openxmlformats.org/wordprocessingml/2006/main" xmlns:w14="http://schemas.microsoft.com/office/word/2010/wordml" xmlns:w15="http://schemas.microsoft.com/office/word/2012/wordml" xmlns:w16cex="http://schemas.microsoft.com/office/word/2018/wordml/cex" xmlns:w16cid="http://schemas.microsoft.com/office/word/2016/wordml/cid" xmlns:w16="http://schemas.microsoft.com/office/word/2018/wordml" xmlns:w16du="http://schemas.microsoft.com/office/word/2023/wordml/word16du" xmlns:w16sdtdh="http://schemas.microsoft.com/office/word/2020/wordml/sdtdatahash" xmlns:w16sdtfl="http://schemas.microsoft.com/office/word/2024/wordml/sdtformatlock" xmlns:w16se="http://schemas.microsoft.com/office/word/2015/wordml/symex" xmlns:wpg="http://schemas.microsoft.com/office/word/2010/wordprocessingGroup" xmlns:wpi="http://schemas.microsoft.com/office/word/2010/wordprocessingInk" xmlns:wne="http://schemas.microsoft.com/office/word/2006/wordml" xmlns:wps="http://schemas.microsoft.com/office/word/2010/wordprocessingShape" mc:Ignorable="w14 w15 w16se w16cid w16 w16cex w16sdtdh w16sdtfl w16du wp14">
   <w:abstractNum w:abstractNumId="0" w15:restartNumberingAfterBreak="0">
-    <w:nsid w:val="759369B3"/>
+    <w:nsid w:val="6A3828A6"/>
     <w:multiLevelType w:val="hybridMultilevel"/>
-    <w:tmpl w:val="D75EE37A"/>
-    <w:lvl w:ilvl="0" w:tplc="E132C518">
+    <w:tmpl w:val="CB7A8020"/>
+    <w:lvl w:ilvl="0" w:tplc="0644CE88">
       <w:start w:val="1"/>
       <w:numFmt w:val="hebrew1"/>
       <w:lvlText w:val="%1."/>
@@ -1687,7 +2205,99 @@
       </w:pPr>
     </w:lvl>
   </w:abstractNum>
+  <w:abstractNum w:abstractNumId="1" w15:restartNumberingAfterBreak="0">
+    <w:nsid w:val="759369B3"/>
+    <w:multiLevelType w:val="hybridMultilevel"/>
+    <w:tmpl w:val="D75EE37A"/>
+    <w:lvl w:ilvl="0" w:tplc="E132C518">
+      <w:start w:val="1"/>
+      <w:numFmt w:val="hebrew1"/>
+      <w:lvlText w:val="%1."/>
+      <w:lvlJc w:val="left"/>
+      <w:pPr>
+        <w:ind w:left="720" w:hanging="360"/>
+      </w:pPr>
+      <w:rPr>
+        <w:rFonts w:hint="default"/>
+      </w:rPr>
+    </w:lvl>
+    <w:lvl w:ilvl="1" w:tplc="04090019" w:tentative="1">
+      <w:start w:val="1"/>
+      <w:numFmt w:val="lowerLetter"/>
+      <w:lvlText w:val="%2."/>
+      <w:lvlJc w:val="left"/>
+      <w:pPr>
+        <w:ind w:left="1440" w:hanging="360"/>
+      </w:pPr>
+    </w:lvl>
+    <w:lvl w:ilvl="2" w:tplc="0409001B" w:tentative="1">
+      <w:start w:val="1"/>
+      <w:numFmt w:val="lowerRoman"/>
+      <w:lvlText w:val="%3."/>
+      <w:lvlJc w:val="right"/>
+      <w:pPr>
+        <w:ind w:left="2160" w:hanging="180"/>
+      </w:pPr>
+    </w:lvl>
+    <w:lvl w:ilvl="3" w:tplc="0409000F" w:tentative="1">
+      <w:start w:val="1"/>
+      <w:numFmt w:val="decimal"/>
+      <w:lvlText w:val="%4."/>
+      <w:lvlJc w:val="left"/>
+      <w:pPr>
+        <w:ind w:left="2880" w:hanging="360"/>
+      </w:pPr>
+    </w:lvl>
+    <w:lvl w:ilvl="4" w:tplc="04090019" w:tentative="1">
+      <w:start w:val="1"/>
+      <w:numFmt w:val="lowerLetter"/>
+      <w:lvlText w:val="%5."/>
+      <w:lvlJc w:val="left"/>
+      <w:pPr>
+        <w:ind w:left="3600" w:hanging="360"/>
+      </w:pPr>
+    </w:lvl>
+    <w:lvl w:ilvl="5" w:tplc="0409001B" w:tentative="1">
+      <w:start w:val="1"/>
+      <w:numFmt w:val="lowerRoman"/>
+      <w:lvlText w:val="%6."/>
+      <w:lvlJc w:val="right"/>
+      <w:pPr>
+        <w:ind w:left="4320" w:hanging="180"/>
+      </w:pPr>
+    </w:lvl>
+    <w:lvl w:ilvl="6" w:tplc="0409000F" w:tentative="1">
+      <w:start w:val="1"/>
+      <w:numFmt w:val="decimal"/>
+      <w:lvlText w:val="%7."/>
+      <w:lvlJc w:val="left"/>
+      <w:pPr>
+        <w:ind w:left="5040" w:hanging="360"/>
+      </w:pPr>
+    </w:lvl>
+    <w:lvl w:ilvl="7" w:tplc="04090019" w:tentative="1">
+      <w:start w:val="1"/>
+      <w:numFmt w:val="lowerLetter"/>
+      <w:lvlText w:val="%8."/>
+      <w:lvlJc w:val="left"/>
+      <w:pPr>
+        <w:ind w:left="5760" w:hanging="360"/>
+      </w:pPr>
+    </w:lvl>
+    <w:lvl w:ilvl="8" w:tplc="0409001B" w:tentative="1">
+      <w:start w:val="1"/>
+      <w:numFmt w:val="lowerRoman"/>
+      <w:lvlText w:val="%9."/>
+      <w:lvlJc w:val="right"/>
+      <w:pPr>
+        <w:ind w:left="6480" w:hanging="180"/>
+      </w:pPr>
+    </w:lvl>
+  </w:abstractNum>
   <w:num w:numId="1" w16cid:durableId="1536842196">
+    <w:abstractNumId w:val="1"/>
+  </w:num>
+  <w:num w:numId="2" w16cid:durableId="1390153671">
     <w:abstractNumId w:val="0"/>
   </w:num>
 </w:numbering>
@@ -2623,6 +3233,29 @@
       <w:color w:val="666666"/>
     </w:rPr>
   </w:style>
+  <w:style w:type="character" w:styleId="Hyperlink">
+    <w:name w:val="Hyperlink"/>
+    <w:basedOn w:val="a0"/>
+    <w:uiPriority w:val="99"/>
+    <w:unhideWhenUsed/>
+    <w:rsid w:val="003943FA"/>
+    <w:rPr>
+      <w:color w:val="467886" w:themeColor="hyperlink"/>
+      <w:u w:val="single"/>
+    </w:rPr>
+  </w:style>
+  <w:style w:type="character" w:styleId="af">
+    <w:name w:val="Unresolved Mention"/>
+    <w:basedOn w:val="a0"/>
+    <w:uiPriority w:val="99"/>
+    <w:semiHidden/>
+    <w:unhideWhenUsed/>
+    <w:rsid w:val="003943FA"/>
+    <w:rPr>
+      <w:color w:val="605E5C"/>
+      <w:shd w:val="clear" w:color="auto" w:fill="E1DFDD"/>
+    </w:rPr>
+  </w:style>
 </w:styles>
 </file>
 

</xml_diff>